<commit_message>
Remove MAC address column from worksheet
Co-Authored-By: Claude Sonnet 5.5 <noreply@anthropic.com>
Claude-Session: https://claude.ai/code/session_01BfWNAo3rPJrP7vU7fTtPF2
</commit_message>
<xml_diff>
--- a/SWG_Worksheet.docx
+++ b/SWG_Worksheet.docx
@@ -46,7 +46,6 @@
         <w:gridCol w:w="1522"/>
         <w:gridCol w:w="1791"/>
         <w:gridCol w:w="1522"/>
-        <w:gridCol w:w="2308"/>
       </w:tblGrid>
       <w:tr>
         <w:trPr>
@@ -128,25 +127,6 @@
             </w:r>
           </w:p>
         </w:tc>
-        <w:tc>
-          <w:tcPr>
-            <w:tcW w:w="2308" w:type="dxa"/>
-            <w:tcMar/>
-          </w:tcPr>
-          <w:p>
-            <w:pPr>
-              <w:spacing w:before="0" w:beforeAutospacing="off" w:after="0" w:afterAutospacing="off"/>
-              <w:jc w:val="center"/>
-            </w:pPr>
-            <w:r>
-              <w:rPr>
-                <w:b w:val="1"/>
-                <w:bCs w:val="1"/>
-              </w:rPr>
-              <w:t>MAC Address</w:t>
-            </w:r>
-          </w:p>
-        </w:tc>
       </w:tr>
       <w:tr>
         <w:trPr>
@@ -212,21 +192,6 @@
             </w:r>
           </w:p>
         </w:tc>
-        <w:tc>
-          <w:tcPr>
-            <w:tcW w:w="2308" w:type="dxa"/>
-            <w:tcMar/>
-          </w:tcPr>
-          <w:p>
-            <w:pPr>
-              <w:spacing w:before="0" w:beforeAutospacing="off" w:after="0" w:afterAutospacing="off"/>
-            </w:pPr>
-            <w:r>
-              <w:rPr/>
-              <w:t>Check Packet Tracer</w:t>
-            </w:r>
-          </w:p>
-        </w:tc>
       </w:tr>
       <w:tr>
         <w:trPr>
@@ -292,21 +257,6 @@
             </w:r>
           </w:p>
         </w:tc>
-        <w:tc>
-          <w:tcPr>
-            <w:tcW w:w="2308" w:type="dxa"/>
-            <w:tcMar/>
-          </w:tcPr>
-          <w:p>
-            <w:pPr>
-              <w:spacing w:before="0" w:beforeAutospacing="off" w:after="0" w:afterAutospacing="off"/>
-            </w:pPr>
-            <w:r>
-              <w:rPr/>
-              <w:t>Check Packet Tracer</w:t>
-            </w:r>
-          </w:p>
-        </w:tc>
       </w:tr>
       <w:tr>
         <w:trPr>
@@ -372,21 +322,6 @@
             </w:r>
           </w:p>
         </w:tc>
-        <w:tc>
-          <w:tcPr>
-            <w:tcW w:w="2308" w:type="dxa"/>
-            <w:tcMar/>
-          </w:tcPr>
-          <w:p>
-            <w:pPr>
-              <w:spacing w:before="0" w:beforeAutospacing="off" w:after="0" w:afterAutospacing="off"/>
-            </w:pPr>
-            <w:r>
-              <w:rPr/>
-              <w:t>Check Packet Tracer</w:t>
-            </w:r>
-          </w:p>
-        </w:tc>
       </w:tr>
       <w:tr>
         <w:trPr>
@@ -449,21 +384,6 @@
             <w:r>
               <w:rPr/>
               <w:t>192.70.20.193</w:t>
-            </w:r>
-          </w:p>
-        </w:tc>
-        <w:tc>
-          <w:tcPr>
-            <w:tcW w:w="2308" w:type="dxa"/>
-            <w:tcMar/>
-          </w:tcPr>
-          <w:p>
-            <w:pPr>
-              <w:spacing w:before="0" w:beforeAutospacing="off" w:after="0" w:afterAutospacing="off"/>
-            </w:pPr>
-            <w:r>
-              <w:rPr/>
-              <w:t>Check Packet Tracer</w:t>
             </w:r>
           </w:p>
         </w:tc>
@@ -498,7 +418,6 @@
         <w:gridCol w:w="1596"/>
         <w:gridCol w:w="2091"/>
         <w:gridCol w:w="1554"/>
-        <w:gridCol w:w="2608"/>
       </w:tblGrid>
       <w:tr>
         <w:trPr>
@@ -584,26 +503,6 @@
             </w:r>
           </w:p>
         </w:tc>
-        <w:tc>
-          <w:tcPr>
-            <w:tcW w:w="2608" w:type="dxa"/>
-            <w:tcMar/>
-          </w:tcPr>
-          <w:p>
-            <w:pPr>
-              <w:bidi w:val="0"/>
-              <w:spacing w:before="0" w:beforeAutospacing="off" w:after="0" w:afterAutospacing="off"/>
-              <w:jc w:val="center"/>
-            </w:pPr>
-            <w:r>
-              <w:rPr>
-                <w:b w:val="1"/>
-                <w:bCs w:val="1"/>
-              </w:rPr>
-              <w:t>MAC Address</w:t>
-            </w:r>
-          </w:p>
-        </w:tc>
       </w:tr>
       <w:tr>
         <w:trPr>
@@ -673,22 +572,6 @@
             </w:r>
           </w:p>
         </w:tc>
-        <w:tc>
-          <w:tcPr>
-            <w:tcW w:w="2608" w:type="dxa"/>
-            <w:tcMar/>
-          </w:tcPr>
-          <w:p>
-            <w:pPr>
-              <w:bidi w:val="0"/>
-              <w:spacing w:before="0" w:beforeAutospacing="off" w:after="0" w:afterAutospacing="off"/>
-            </w:pPr>
-            <w:r>
-              <w:rPr/>
-              <w:t>Check Packet Tracer</w:t>
-            </w:r>
-          </w:p>
-        </w:tc>
       </w:tr>
       <w:tr>
         <w:trPr>
@@ -758,22 +641,6 @@
             </w:r>
           </w:p>
         </w:tc>
-        <w:tc>
-          <w:tcPr>
-            <w:tcW w:w="2608" w:type="dxa"/>
-            <w:tcMar/>
-          </w:tcPr>
-          <w:p>
-            <w:pPr>
-              <w:bidi w:val="0"/>
-              <w:spacing w:before="0" w:beforeAutospacing="off" w:after="0" w:afterAutospacing="off"/>
-            </w:pPr>
-            <w:r>
-              <w:rPr/>
-              <w:t>Check Packet Tracer</w:t>
-            </w:r>
-          </w:p>
-        </w:tc>
       </w:tr>
       <w:tr>
         <w:trPr>
@@ -840,22 +707,6 @@
             <w:r>
               <w:rPr/>
               <w:t>192.70.20.1</w:t>
-            </w:r>
-          </w:p>
-        </w:tc>
-        <w:tc>
-          <w:tcPr>
-            <w:tcW w:w="2608" w:type="dxa"/>
-            <w:tcMar/>
-          </w:tcPr>
-          <w:p>
-            <w:pPr>
-              <w:bidi w:val="0"/>
-              <w:spacing w:before="0" w:beforeAutospacing="off" w:after="0" w:afterAutospacing="off"/>
-            </w:pPr>
-            <w:r>
-              <w:rPr/>
-              <w:t>Check Packet Tracer</w:t>
             </w:r>
           </w:p>
         </w:tc>
@@ -888,7 +739,6 @@
         <w:gridCol w:w="1872"/>
         <w:gridCol w:w="1872"/>
         <w:gridCol w:w="1872"/>
-        <w:gridCol w:w="1872"/>
       </w:tblGrid>
       <w:tr>
         <w:trPr>
@@ -974,26 +824,6 @@
             </w:r>
           </w:p>
         </w:tc>
-        <w:tc>
-          <w:tcPr>
-            <w:tcW w:w="1872" w:type="dxa"/>
-            <w:tcMar/>
-          </w:tcPr>
-          <w:p>
-            <w:pPr>
-              <w:bidi w:val="0"/>
-              <w:spacing w:before="0" w:beforeAutospacing="off" w:after="0" w:afterAutospacing="off"/>
-              <w:jc w:val="center"/>
-            </w:pPr>
-            <w:r>
-              <w:rPr>
-                <w:b w:val="1"/>
-                <w:bCs w:val="1"/>
-              </w:rPr>
-              <w:t>MAC Address</w:t>
-            </w:r>
-          </w:p>
-        </w:tc>
       </w:tr>
       <w:tr>
         <w:trPr>
@@ -1063,22 +893,6 @@
             </w:r>
           </w:p>
         </w:tc>
-        <w:tc>
-          <w:tcPr>
-            <w:tcW w:w="1872" w:type="dxa"/>
-            <w:tcMar/>
-          </w:tcPr>
-          <w:p>
-            <w:pPr>
-              <w:bidi w:val="0"/>
-              <w:spacing w:before="0" w:beforeAutospacing="off" w:after="0" w:afterAutospacing="off"/>
-            </w:pPr>
-            <w:r>
-              <w:rPr/>
-              <w:t>Check Packet Tracer</w:t>
-            </w:r>
-          </w:p>
-        </w:tc>
       </w:tr>
       <w:tr>
         <w:trPr>
@@ -1148,22 +962,6 @@
             </w:r>
           </w:p>
         </w:tc>
-        <w:tc>
-          <w:tcPr>
-            <w:tcW w:w="1872" w:type="dxa"/>
-            <w:tcMar/>
-          </w:tcPr>
-          <w:p>
-            <w:pPr>
-              <w:bidi w:val="0"/>
-              <w:spacing w:before="0" w:beforeAutospacing="off" w:after="0" w:afterAutospacing="off"/>
-            </w:pPr>
-            <w:r>
-              <w:rPr/>
-              <w:t>Check Packet Tracer</w:t>
-            </w:r>
-          </w:p>
-        </w:tc>
       </w:tr>
       <w:tr>
         <w:trPr>
@@ -1230,22 +1028,6 @@
             <w:r>
               <w:rPr/>
               <w:t>192.70.20.97</w:t>
-            </w:r>
-          </w:p>
-        </w:tc>
-        <w:tc>
-          <w:tcPr>
-            <w:tcW w:w="1872" w:type="dxa"/>
-            <w:tcMar/>
-          </w:tcPr>
-          <w:p>
-            <w:pPr>
-              <w:bidi w:val="0"/>
-              <w:spacing w:before="0" w:beforeAutospacing="off" w:after="0" w:afterAutospacing="off"/>
-            </w:pPr>
-            <w:r>
-              <w:rPr/>
-              <w:t>Check Packet Tracer</w:t>
             </w:r>
           </w:p>
         </w:tc>
@@ -1293,7 +1075,6 @@
         <w:gridCol w:w="1872"/>
         <w:gridCol w:w="1872"/>
         <w:gridCol w:w="1872"/>
-        <w:gridCol w:w="1872"/>
       </w:tblGrid>
       <w:tr>
         <w:trPr>
@@ -1379,26 +1160,6 @@
             </w:r>
           </w:p>
         </w:tc>
-        <w:tc>
-          <w:tcPr>
-            <w:tcW w:w="1872" w:type="dxa"/>
-            <w:tcMar/>
-          </w:tcPr>
-          <w:p>
-            <w:pPr>
-              <w:bidi w:val="0"/>
-              <w:spacing w:before="0" w:beforeAutospacing="off" w:after="0" w:afterAutospacing="off"/>
-              <w:jc w:val="center"/>
-            </w:pPr>
-            <w:r>
-              <w:rPr>
-                <w:b w:val="1"/>
-                <w:bCs w:val="1"/>
-              </w:rPr>
-              <w:t>MAC Address</w:t>
-            </w:r>
-          </w:p>
-        </w:tc>
       </w:tr>
       <w:tr>
         <w:trPr>
@@ -1468,22 +1229,6 @@
             </w:r>
           </w:p>
         </w:tc>
-        <w:tc>
-          <w:tcPr>
-            <w:tcW w:w="1872" w:type="dxa"/>
-            <w:tcMar/>
-          </w:tcPr>
-          <w:p>
-            <w:pPr>
-              <w:bidi w:val="0"/>
-              <w:spacing w:before="0" w:beforeAutospacing="off" w:after="0" w:afterAutospacing="off"/>
-            </w:pPr>
-            <w:r>
-              <w:rPr/>
-              <w:t>Check Packet Tracer</w:t>
-            </w:r>
-          </w:p>
-        </w:tc>
       </w:tr>
       <w:tr>
         <w:trPr>
@@ -1550,22 +1295,6 @@
             <w:r>
               <w:rPr/>
               <w:t>192.70.20.209</w:t>
-            </w:r>
-          </w:p>
-        </w:tc>
-        <w:tc>
-          <w:tcPr>
-            <w:tcW w:w="1872" w:type="dxa"/>
-            <w:tcMar/>
-          </w:tcPr>
-          <w:p>
-            <w:pPr>
-              <w:bidi w:val="0"/>
-              <w:spacing w:before="0" w:beforeAutospacing="off" w:after="0" w:afterAutospacing="off"/>
-            </w:pPr>
-            <w:r>
-              <w:rPr/>
-              <w:t>Check Packet Tracer</w:t>
             </w:r>
           </w:p>
         </w:tc>
@@ -1598,7 +1327,6 @@
         <w:gridCol w:w="1872"/>
         <w:gridCol w:w="1872"/>
         <w:gridCol w:w="1872"/>
-        <w:gridCol w:w="1872"/>
       </w:tblGrid>
       <w:tr>
         <w:trPr>
@@ -1684,26 +1412,6 @@
             </w:r>
           </w:p>
         </w:tc>
-        <w:tc>
-          <w:tcPr>
-            <w:tcW w:w="1872" w:type="dxa"/>
-            <w:tcMar/>
-          </w:tcPr>
-          <w:p>
-            <w:pPr>
-              <w:bidi w:val="0"/>
-              <w:spacing w:before="0" w:beforeAutospacing="off" w:after="0" w:afterAutospacing="off"/>
-              <w:jc w:val="center"/>
-            </w:pPr>
-            <w:r>
-              <w:rPr>
-                <w:b w:val="1"/>
-                <w:bCs w:val="1"/>
-              </w:rPr>
-              <w:t>MAC Address</w:t>
-            </w:r>
-          </w:p>
-        </w:tc>
       </w:tr>
       <w:tr>
         <w:trPr>
@@ -1773,22 +1481,6 @@
             </w:r>
           </w:p>
         </w:tc>
-        <w:tc>
-          <w:tcPr>
-            <w:tcW w:w="1872" w:type="dxa"/>
-            <w:tcMar/>
-          </w:tcPr>
-          <w:p>
-            <w:pPr>
-              <w:bidi w:val="0"/>
-              <w:spacing w:before="0" w:beforeAutospacing="off" w:after="0" w:afterAutospacing="off"/>
-            </w:pPr>
-            <w:r>
-              <w:rPr/>
-              <w:t>Check Packet Tracer</w:t>
-            </w:r>
-          </w:p>
-        </w:tc>
       </w:tr>
       <w:tr>
         <w:trPr>
@@ -1858,22 +1550,6 @@
             </w:r>
           </w:p>
         </w:tc>
-        <w:tc>
-          <w:tcPr>
-            <w:tcW w:w="1872" w:type="dxa"/>
-            <w:tcMar/>
-          </w:tcPr>
-          <w:p>
-            <w:pPr>
-              <w:bidi w:val="0"/>
-              <w:spacing w:before="0" w:beforeAutospacing="off" w:after="0" w:afterAutospacing="off"/>
-            </w:pPr>
-            <w:r>
-              <w:rPr/>
-              <w:t>Check Packet Tracer</w:t>
-            </w:r>
-          </w:p>
-        </w:tc>
       </w:tr>
       <w:tr>
         <w:trPr>
@@ -1943,22 +1619,6 @@
             </w:r>
           </w:p>
         </w:tc>
-        <w:tc>
-          <w:tcPr>
-            <w:tcW w:w="1872" w:type="dxa"/>
-            <w:tcMar/>
-          </w:tcPr>
-          <w:p>
-            <w:pPr>
-              <w:bidi w:val="0"/>
-              <w:spacing w:before="0" w:beforeAutospacing="off" w:after="0" w:afterAutospacing="off"/>
-            </w:pPr>
-            <w:r>
-              <w:rPr/>
-              <w:t>Check Packet Tracer</w:t>
-            </w:r>
-          </w:p>
-        </w:tc>
       </w:tr>
       <w:tr>
         <w:trPr>
@@ -2025,22 +1685,6 @@
             <w:r>
               <w:rPr/>
               <w:t>192.70.20.33</w:t>
-            </w:r>
-          </w:p>
-        </w:tc>
-        <w:tc>
-          <w:tcPr>
-            <w:tcW w:w="1872" w:type="dxa"/>
-            <w:tcMar/>
-          </w:tcPr>
-          <w:p>
-            <w:pPr>
-              <w:bidi w:val="0"/>
-              <w:spacing w:before="0" w:beforeAutospacing="off" w:after="0" w:afterAutospacing="off"/>
-            </w:pPr>
-            <w:r>
-              <w:rPr/>
-              <w:t>Check Packet Tracer</w:t>
             </w:r>
           </w:p>
         </w:tc>
@@ -2073,7 +1717,6 @@
         <w:gridCol w:w="1872"/>
         <w:gridCol w:w="1872"/>
         <w:gridCol w:w="1872"/>
-        <w:gridCol w:w="1872"/>
       </w:tblGrid>
       <w:tr>
         <w:trPr>
@@ -2159,26 +1802,6 @@
             </w:r>
           </w:p>
         </w:tc>
-        <w:tc>
-          <w:tcPr>
-            <w:tcW w:w="1872" w:type="dxa"/>
-            <w:tcMar/>
-          </w:tcPr>
-          <w:p>
-            <w:pPr>
-              <w:bidi w:val="0"/>
-              <w:spacing w:before="0" w:beforeAutospacing="off" w:after="0" w:afterAutospacing="off"/>
-              <w:jc w:val="center"/>
-            </w:pPr>
-            <w:r>
-              <w:rPr>
-                <w:b w:val="1"/>
-                <w:bCs w:val="1"/>
-              </w:rPr>
-              <w:t>MAC Address</w:t>
-            </w:r>
-          </w:p>
-        </w:tc>
       </w:tr>
       <w:tr>
         <w:trPr>
@@ -2248,22 +1871,6 @@
             </w:r>
           </w:p>
         </w:tc>
-        <w:tc>
-          <w:tcPr>
-            <w:tcW w:w="1872" w:type="dxa"/>
-            <w:tcMar/>
-          </w:tcPr>
-          <w:p>
-            <w:pPr>
-              <w:bidi w:val="0"/>
-              <w:spacing w:before="0" w:beforeAutospacing="off" w:after="0" w:afterAutospacing="off"/>
-            </w:pPr>
-            <w:r>
-              <w:rPr/>
-              <w:t>Check Packet Tracer</w:t>
-            </w:r>
-          </w:p>
-        </w:tc>
       </w:tr>
       <w:tr>
         <w:trPr>
@@ -2333,22 +1940,6 @@
             </w:r>
           </w:p>
         </w:tc>
-        <w:tc>
-          <w:tcPr>
-            <w:tcW w:w="1872" w:type="dxa"/>
-            <w:tcMar/>
-          </w:tcPr>
-          <w:p>
-            <w:pPr>
-              <w:bidi w:val="0"/>
-              <w:spacing w:before="0" w:beforeAutospacing="off" w:after="0" w:afterAutospacing="off"/>
-            </w:pPr>
-            <w:r>
-              <w:rPr/>
-              <w:t>Check Packet Tracer</w:t>
-            </w:r>
-          </w:p>
-        </w:tc>
       </w:tr>
       <w:tr>
         <w:trPr>
@@ -2418,22 +2009,6 @@
             </w:r>
           </w:p>
         </w:tc>
-        <w:tc>
-          <w:tcPr>
-            <w:tcW w:w="1872" w:type="dxa"/>
-            <w:tcMar/>
-          </w:tcPr>
-          <w:p>
-            <w:pPr>
-              <w:bidi w:val="0"/>
-              <w:spacing w:before="0" w:beforeAutospacing="off" w:after="0" w:afterAutospacing="off"/>
-            </w:pPr>
-            <w:r>
-              <w:rPr/>
-              <w:t>Check Packet Tracer</w:t>
-            </w:r>
-          </w:p>
-        </w:tc>
       </w:tr>
       <w:tr>
         <w:trPr>
@@ -2500,22 +2075,6 @@
             <w:r>
               <w:rPr/>
               <w:t>192.70.20.129</w:t>
-            </w:r>
-          </w:p>
-        </w:tc>
-        <w:tc>
-          <w:tcPr>
-            <w:tcW w:w="1872" w:type="dxa"/>
-            <w:tcMar/>
-          </w:tcPr>
-          <w:p>
-            <w:pPr>
-              <w:bidi w:val="0"/>
-              <w:spacing w:before="0" w:beforeAutospacing="off" w:after="0" w:afterAutospacing="off"/>
-            </w:pPr>
-            <w:r>
-              <w:rPr/>
-              <w:t>Check Packet Tracer</w:t>
             </w:r>
           </w:p>
         </w:tc>
@@ -2563,7 +2122,6 @@
         <w:gridCol w:w="1872"/>
         <w:gridCol w:w="1872"/>
         <w:gridCol w:w="1872"/>
-        <w:gridCol w:w="1872"/>
       </w:tblGrid>
       <w:tr>
         <w:trPr>
@@ -2649,26 +2207,6 @@
             </w:r>
           </w:p>
         </w:tc>
-        <w:tc>
-          <w:tcPr>
-            <w:tcW w:w="1872" w:type="dxa"/>
-            <w:tcMar/>
-          </w:tcPr>
-          <w:p>
-            <w:pPr>
-              <w:bidi w:val="0"/>
-              <w:spacing w:before="0" w:beforeAutospacing="off" w:after="0" w:afterAutospacing="off"/>
-              <w:jc w:val="center"/>
-            </w:pPr>
-            <w:r>
-              <w:rPr>
-                <w:b w:val="1"/>
-                <w:bCs w:val="1"/>
-              </w:rPr>
-              <w:t>MAC Address</w:t>
-            </w:r>
-          </w:p>
-        </w:tc>
       </w:tr>
       <w:tr>
         <w:trPr>
@@ -2738,22 +2276,6 @@
             </w:r>
           </w:p>
         </w:tc>
-        <w:tc>
-          <w:tcPr>
-            <w:tcW w:w="1872" w:type="dxa"/>
-            <w:tcMar/>
-          </w:tcPr>
-          <w:p>
-            <w:pPr>
-              <w:bidi w:val="0"/>
-              <w:spacing w:before="0" w:beforeAutospacing="off" w:after="0" w:afterAutospacing="off"/>
-            </w:pPr>
-            <w:r>
-              <w:rPr/>
-              <w:t>Check Packet Tracer</w:t>
-            </w:r>
-          </w:p>
-        </w:tc>
       </w:tr>
       <w:tr>
         <w:trPr>
@@ -2820,22 +2342,6 @@
             <w:r>
               <w:rPr/>
               <w:t>192.70.20.225</w:t>
-            </w:r>
-          </w:p>
-        </w:tc>
-        <w:tc>
-          <w:tcPr>
-            <w:tcW w:w="1872" w:type="dxa"/>
-            <w:tcMar/>
-          </w:tcPr>
-          <w:p>
-            <w:pPr>
-              <w:bidi w:val="0"/>
-              <w:spacing w:before="0" w:beforeAutospacing="off" w:after="0" w:afterAutospacing="off"/>
-            </w:pPr>
-            <w:r>
-              <w:rPr/>
-              <w:t>Check Packet Tracer</w:t>
             </w:r>
           </w:p>
         </w:tc>
@@ -2868,7 +2374,6 @@
         <w:gridCol w:w="1872"/>
         <w:gridCol w:w="1872"/>
         <w:gridCol w:w="1872"/>
-        <w:gridCol w:w="1872"/>
       </w:tblGrid>
       <w:tr>
         <w:trPr>
@@ -2954,26 +2459,6 @@
             </w:r>
           </w:p>
         </w:tc>
-        <w:tc>
-          <w:tcPr>
-            <w:tcW w:w="1872" w:type="dxa"/>
-            <w:tcMar/>
-          </w:tcPr>
-          <w:p>
-            <w:pPr>
-              <w:bidi w:val="0"/>
-              <w:spacing w:before="0" w:beforeAutospacing="off" w:after="0" w:afterAutospacing="off"/>
-              <w:jc w:val="center"/>
-            </w:pPr>
-            <w:r>
-              <w:rPr>
-                <w:b w:val="1"/>
-                <w:bCs w:val="1"/>
-              </w:rPr>
-              <w:t>MAC Address</w:t>
-            </w:r>
-          </w:p>
-        </w:tc>
       </w:tr>
       <w:tr>
         <w:trPr>
@@ -3043,22 +2528,6 @@
             </w:r>
           </w:p>
         </w:tc>
-        <w:tc>
-          <w:tcPr>
-            <w:tcW w:w="1872" w:type="dxa"/>
-            <w:tcMar/>
-          </w:tcPr>
-          <w:p>
-            <w:pPr>
-              <w:bidi w:val="0"/>
-              <w:spacing w:before="0" w:beforeAutospacing="off" w:after="0" w:afterAutospacing="off"/>
-            </w:pPr>
-            <w:r>
-              <w:rPr/>
-              <w:t>Check Packet Tracer</w:t>
-            </w:r>
-          </w:p>
-        </w:tc>
       </w:tr>
       <w:tr>
         <w:trPr>
@@ -3128,22 +2597,6 @@
             </w:r>
           </w:p>
         </w:tc>
-        <w:tc>
-          <w:tcPr>
-            <w:tcW w:w="1872" w:type="dxa"/>
-            <w:tcMar/>
-          </w:tcPr>
-          <w:p>
-            <w:pPr>
-              <w:bidi w:val="0"/>
-              <w:spacing w:before="0" w:beforeAutospacing="off" w:after="0" w:afterAutospacing="off"/>
-            </w:pPr>
-            <w:r>
-              <w:rPr/>
-              <w:t>Check Packet Tracer</w:t>
-            </w:r>
-          </w:p>
-        </w:tc>
       </w:tr>
       <w:tr>
         <w:trPr>
@@ -3210,22 +2663,6 @@
             <w:r>
               <w:rPr/>
               <w:t>192.70.20.65</w:t>
-            </w:r>
-          </w:p>
-        </w:tc>
-        <w:tc>
-          <w:tcPr>
-            <w:tcW w:w="1872" w:type="dxa"/>
-            <w:tcMar/>
-          </w:tcPr>
-          <w:p>
-            <w:pPr>
-              <w:bidi w:val="0"/>
-              <w:spacing w:before="0" w:beforeAutospacing="off" w:after="0" w:afterAutospacing="off"/>
-            </w:pPr>
-            <w:r>
-              <w:rPr/>
-              <w:t>Check Packet Tracer</w:t>
             </w:r>
           </w:p>
         </w:tc>
@@ -3258,7 +2695,6 @@
         <w:gridCol w:w="1872"/>
         <w:gridCol w:w="1872"/>
         <w:gridCol w:w="1872"/>
-        <w:gridCol w:w="1872"/>
       </w:tblGrid>
       <w:tr>
         <w:trPr>
@@ -3344,26 +2780,6 @@
             </w:r>
           </w:p>
         </w:tc>
-        <w:tc>
-          <w:tcPr>
-            <w:tcW w:w="1872" w:type="dxa"/>
-            <w:tcMar/>
-          </w:tcPr>
-          <w:p>
-            <w:pPr>
-              <w:bidi w:val="0"/>
-              <w:spacing w:before="0" w:beforeAutospacing="off" w:after="0" w:afterAutospacing="off"/>
-              <w:jc w:val="center"/>
-            </w:pPr>
-            <w:r>
-              <w:rPr>
-                <w:b w:val="1"/>
-                <w:bCs w:val="1"/>
-              </w:rPr>
-              <w:t>MAC Address</w:t>
-            </w:r>
-          </w:p>
-        </w:tc>
       </w:tr>
       <w:tr>
         <w:trPr>
@@ -3433,22 +2849,6 @@
             </w:r>
           </w:p>
         </w:tc>
-        <w:tc>
-          <w:tcPr>
-            <w:tcW w:w="1872" w:type="dxa"/>
-            <w:tcMar/>
-          </w:tcPr>
-          <w:p>
-            <w:pPr>
-              <w:bidi w:val="0"/>
-              <w:spacing w:before="0" w:beforeAutospacing="off" w:after="0" w:afterAutospacing="off"/>
-            </w:pPr>
-            <w:r>
-              <w:rPr/>
-              <w:t>Check Packet Tracer</w:t>
-            </w:r>
-          </w:p>
-        </w:tc>
       </w:tr>
       <w:tr>
         <w:trPr>
@@ -3518,22 +2918,6 @@
             </w:r>
           </w:p>
         </w:tc>
-        <w:tc>
-          <w:tcPr>
-            <w:tcW w:w="1872" w:type="dxa"/>
-            <w:tcMar/>
-          </w:tcPr>
-          <w:p>
-            <w:pPr>
-              <w:bidi w:val="0"/>
-              <w:spacing w:before="0" w:beforeAutospacing="off" w:after="0" w:afterAutospacing="off"/>
-            </w:pPr>
-            <w:r>
-              <w:rPr/>
-              <w:t>Check Packet Tracer</w:t>
-            </w:r>
-          </w:p>
-        </w:tc>
       </w:tr>
       <w:tr>
         <w:trPr>
@@ -3600,22 +2984,6 @@
             <w:r>
               <w:rPr/>
               <w:t>192.70.20.161</w:t>
-            </w:r>
-          </w:p>
-        </w:tc>
-        <w:tc>
-          <w:tcPr>
-            <w:tcW w:w="1872" w:type="dxa"/>
-            <w:tcMar/>
-          </w:tcPr>
-          <w:p>
-            <w:pPr>
-              <w:bidi w:val="0"/>
-              <w:spacing w:before="0" w:beforeAutospacing="off" w:after="0" w:afterAutospacing="off"/>
-            </w:pPr>
-            <w:r>
-              <w:rPr/>
-              <w:t>Check Packet Tracer</w:t>
             </w:r>
           </w:p>
         </w:tc>

</xml_diff>